<commit_message>
Answer the five scholarly-products slots with "None to date."
The applicant has no publications yet. The five empty [Citation N] list
items read as an unfinished form, so they are replaced with one sentence
that answers the question and points to the anticipated products under
question 5.

The funder's own NOTE above these questions allows it: "You may omit this
question and the next if they are not applicable."

Layout: PREV 3 falls from 0.16 to 0.06 of its half page, page 7 gains
about 53 pt, and the document stays at 9 pages against the 10-page
maximum. Verified on a rendered PDF, not only Word's page count: no
column leakage, no [Citation marker left anywhere. 24 zip entries, no
layout-cache artifacts.

Docs follow: the hand-off drops from 17 placeholders to 15 outstanding
items, and both it and the checklist now record that the half page is
not the binding limit here - the bottom of page 7 is.
</commit_message>
<xml_diff>
--- a/docs/proposal/Research_Proposal_Air_Deployed_Seismic_Mesh.docx
+++ b/docs/proposal/Research_Proposal_Air_Deployed_Seismic_Mesh.docx
@@ -6661,72 +6661,11 @@
     </w:p>
     <w:p>
       <w:pPr>
-        <w:pStyle w:val="ListParagraph"/>
-        <w:numPr>
-          <w:ilvl w:val="0"/>
-          <w:numId w:val="3"/>
-        </w:numPr>
-        <w:spacing w:after="60" w:line="264"/>
+        <w:spacing w:after="100" w:line="264"/>
         <w:jc w:val="both"/>
       </w:pPr>
       <w:r>
-        <w:t xml:space="preserve">[Citation 1]</w:t>
-      </w:r>
-    </w:p>
-    <w:p>
-      <w:pPr>
-        <w:pStyle w:val="ListParagraph"/>
-        <w:numPr>
-          <w:ilvl w:val="0"/>
-          <w:numId w:val="3"/>
-        </w:numPr>
-        <w:spacing w:after="60" w:line="264"/>
-        <w:jc w:val="both"/>
-      </w:pPr>
-      <w:r>
-        <w:t xml:space="preserve">[Citation 2]</w:t>
-      </w:r>
-    </w:p>
-    <w:p>
-      <w:pPr>
-        <w:pStyle w:val="ListParagraph"/>
-        <w:numPr>
-          <w:ilvl w:val="0"/>
-          <w:numId w:val="3"/>
-        </w:numPr>
-        <w:spacing w:after="60" w:line="264"/>
-        <w:jc w:val="both"/>
-      </w:pPr>
-      <w:r>
-        <w:t xml:space="preserve">[Citation 3]</w:t>
-      </w:r>
-    </w:p>
-    <w:p>
-      <w:pPr>
-        <w:pStyle w:val="ListParagraph"/>
-        <w:numPr>
-          <w:ilvl w:val="0"/>
-          <w:numId w:val="3"/>
-        </w:numPr>
-        <w:spacing w:after="60" w:line="264"/>
-        <w:jc w:val="both"/>
-      </w:pPr>
-      <w:r>
-        <w:t xml:space="preserve">[Citation 4]</w:t>
-      </w:r>
-    </w:p>
-    <w:p>
-      <w:pPr>
-        <w:pStyle w:val="ListParagraph"/>
-        <w:numPr>
-          <w:ilvl w:val="0"/>
-          <w:numId w:val="3"/>
-        </w:numPr>
-        <w:spacing w:after="60" w:line="264"/>
-        <w:jc w:val="both"/>
-      </w:pPr>
-      <w:r>
-        <w:t xml:space="preserve">[Citation 5]</w:t>
+        <w:t xml:space="preserve">None to date. This application is for a first research project; no scholarly products have been published yet. Products arising from the work proposed here are listed under question 5 above.</w:t>
       </w:r>
     </w:p>
     <w:p>

</xml_diff>